<commit_message>
Skript 2: Ergänzungen und Abbildungen passend zu den neuen Folien
- Originaltext unverändert; neue Kästen „Ergänzung zur Vorlesung“
  (Verfügbarkeit aus MTBF/MTTR, dokumentierte Vorfälle AWS/OVHcloud/GitLab)
- Hinweis zu den zwei Reifegradskalen (Abschnitt 4.3 vs. 5.2)
- Drei Abbildungen: Resilienzkurve, Reifegrad-Matrix, drei Kurven
- Vorbemerkung nennt die neuen Kastentypen und Abbildungen
- Skript-02 als HTML, PDF und Word neu erzeugt

Co-Authored-By: Claude Opus 5.5 <noreply@anthropic.com>
Claude-Session: https://claude.ai/code/session_015aMBAwS89vz8hBY1Np4Es8
</commit_message>
<xml_diff>
--- a/_output/skripte/Skript-02.docx
+++ b/_output/skripte/Skript-02.docx
@@ -57,7 +57,7 @@
         <w:pStyle w:val="BodyText"/>
       </w:pPr>
       <w:r>
-        <w:t xml:space="preserve">Die mit „Hinweis zur Aktualität“ markierten Kästen wurden bei der Überführung ins Quarto-Projekt ergänzt. Der übrige Text entspricht dem Skript aus dem Wintersemester 2025/26; korrigiert wurden nur Tipp- und Umbruchfehler.</w:t>
+        <w:t xml:space="preserve">Die mit „Hinweis zur Aktualität“ und „Ergänzung zur Vorlesung“ markierten Kästen sowie die Abbildungen wurden bei der Überführung ins Quarto-Projekt ergänzt. Der übrige Text entspricht dem Skript aus dem Wintersemester 2025/26; korrigiert wurden nur Tipp- und Umbruchfehler.</w:t>
       </w:r>
     </w:p>
     <w:bookmarkStart w:id="19" w:name="X4846c0d426fd01255499d88766c0fcd3d56b8c7"/>
@@ -368,7 +368,7 @@
       </w:r>
     </w:p>
     <w:bookmarkEnd w:id="19"/>
-    <w:bookmarkStart w:id="20" w:name="X730be04780e084d3ccc85ad428cbc69827a2a1a"/>
+    <w:bookmarkStart w:id="23" w:name="X730be04780e084d3ccc85ad428cbc69827a2a1a"/>
     <w:p>
       <w:pPr>
         <w:pStyle w:val="Heading1"/>
@@ -635,7 +635,62 @@
     </w:p>
     <w:p>
       <w:pPr>
-        <w:pStyle w:val="FirstParagraph"/>
+        <w:pStyle w:val="CaptionedFigure"/>
+      </w:pPr>
+      <w:r>
+        <w:drawing>
+          <wp:inline>
+            <wp:extent cx="5177790" cy="2388357"/>
+            <wp:effectExtent b="0" l="0" r="0" t="0"/>
+            <wp:docPr descr="Schematische Degradations- und Wiederherstellungskurve mit RPO, RTO und Ausfalltiefe Δ" title="" id="21" name="Picture"/>
+            <a:graphic>
+              <a:graphicData uri="http://schemas.openxmlformats.org/drawingml/2006/picture">
+                <pic:pic>
+                  <pic:nvPicPr>
+                    <pic:cNvPr descr="../assets/resilienzkurve.png" id="22" name="Picture"/>
+                    <pic:cNvPicPr>
+                      <a:picLocks noChangeArrowheads="1" noChangeAspect="1"/>
+                    </pic:cNvPicPr>
+                  </pic:nvPicPr>
+                  <pic:blipFill>
+                    <a:blip r:embed="rId20"/>
+                    <a:stretch>
+                      <a:fillRect/>
+                    </a:stretch>
+                  </pic:blipFill>
+                  <pic:spPr bwMode="auto">
+                    <a:xfrm>
+                      <a:off x="0" y="0"/>
+                      <a:ext cx="5177790" cy="2388357"/>
+                    </a:xfrm>
+                    <a:prstGeom prst="rect">
+                      <a:avLst/>
+                    </a:prstGeom>
+                    <a:noFill/>
+                    <a:ln w="9525">
+                      <a:noFill/>
+                      <a:headEnd/>
+                      <a:tailEnd/>
+                    </a:ln>
+                  </pic:spPr>
+                </pic:pic>
+              </a:graphicData>
+            </a:graphic>
+          </wp:inline>
+        </w:drawing>
+      </w:r>
+    </w:p>
+    <w:p>
+      <w:pPr>
+        <w:pStyle w:val="ImageCaption"/>
+      </w:pPr>
+      <w:r>
+        <w:t xml:space="preserve">Schematische Degradations- und Wiederherstellungskurve mit RPO, RTO und Ausfalltiefe Δ</w:t>
+      </w:r>
+    </w:p>
+    <w:p>
+      <w:pPr>
+        <w:pStyle w:val="BodyText"/>
       </w:pPr>
       <w:r>
         <w:t xml:space="preserve">Diese Größen sind in Normen institutionalisiert (vgl. ISO/IEC 27031; BSI-200-4) und werden als Grundlage für Zielvereinbarungen und Architekturentscheidungen verwendet. Die amerikanische Cyber-Resilience-Norm</w:t>
@@ -704,8 +759,8 @@
         <w:t xml:space="preserve">: Ob eine Wiederherstellung durch Backup, durch Umschaltung, durch Redundanz oder durch manuelle Notfallprozesse erfolgt – die Kurve misst das Ergebnis, nicht den Weg.</w:t>
       </w:r>
     </w:p>
-    <w:bookmarkEnd w:id="20"/>
-    <w:bookmarkStart w:id="21" w:name="Xafcb13c63bf009a0867b814004af19a67719652"/>
+    <w:bookmarkEnd w:id="23"/>
+    <w:bookmarkStart w:id="27" w:name="Xafcb13c63bf009a0867b814004af19a67719652"/>
     <w:p>
       <w:pPr>
         <w:pStyle w:val="Heading1"/>
@@ -1120,8 +1175,285 @@
         <w:t xml:space="preserve">adressiert — nicht die Abwesenheit von Fehlern, sondern den Umgang damit.</w:t>
       </w:r>
     </w:p>
-    <w:bookmarkEnd w:id="21"/>
-    <w:bookmarkStart w:id="34" w:name="X0ad50e47d928f1e4970cd1288e7574496667fca"/>
+    <w:tbl>
+      <w:tblPr>
+        <w:tblStyle w:val="Table"/>
+        <w:tblLook w:firstRow="0" w:lastRow="0" w:firstColumn="0" w:lastColumn="0" w:noHBand="0" w:noVBand="0" w:val="0000"/>
+        <w:tblBorders>
+          <w:top w:val="single" w:sz="4" w:space="0" w:color="00A047"/>
+          <w:left w:val="single" w:sz="24" w:space="0" w:color="00A047"/>
+          <w:bottom w:val="single" w:sz="4" w:space="0" w:color="00A047"/>
+          <w:right w:val="single" w:sz="4" w:space="0" w:color="00A047"/>
+        </w:tblBorders>
+        <w:tblCellMar>
+          <w:left w:w="144" w:type="dxa"/>
+          <w:right w:w="144" w:type="dxa"/>
+        </w:tblCellMar>
+        <w:tblLook w:firstRow="0" w:lastRow="0" w:firstColumn="0" w:lastColumn="0" w:noHBand="0" w:noVBand="0" w:val="0000"/>
+      </w:tblPr>
+      <w:tr>
+        <w:trPr>
+          <w:cantSplit/>
+        </w:trPr>
+        <w:tc>
+          <w:tcPr>
+            <w:shd w:color="auto" w:fill="ccf1e3" w:val="clear"/>
+            <w:tcMar>
+              <w:top w:w="92" w:type="dxa"/>
+              <w:bottom w:w="92" w:type="dxa"/>
+            </w:tcMar>
+          </w:tcPr>
+          <w:p>
+            <w:pPr>
+              <w:pStyle w:val="BodyText"/>
+            </w:pPr>
+            <w:pPr>
+              <w:spacing w:before="0" w:after="0"/>
+              <w:textAlignment w:val="center"/>
+            </w:pPr>
+            <w:r>
+              <w:drawing>
+                <wp:inline>
+                  <wp:extent cx="152400" cy="152400"/>
+                  <wp:effectExtent b="0" l="0" r="0" t="0"/>
+                  <wp:docPr descr="" title="" id="25" name="Picture"/>
+                  <a:graphic>
+                    <a:graphicData uri="http://schemas.openxmlformats.org/drawingml/2006/picture">
+                      <pic:pic>
+                        <pic:nvPicPr>
+                          <pic:cNvPr descr="/usr/local/lib/python3.13/dist-packages/quarto_cli/share/formats/docx/tip.png" id="26" name="Picture"/>
+                          <pic:cNvPicPr>
+                            <a:picLocks noChangeArrowheads="1" noChangeAspect="1"/>
+                          </pic:cNvPicPr>
+                        </pic:nvPicPr>
+                        <pic:blipFill>
+                          <a:blip r:embed="rId24"/>
+                          <a:stretch>
+                            <a:fillRect/>
+                          </a:stretch>
+                        </pic:blipFill>
+                        <pic:spPr bwMode="auto">
+                          <a:xfrm>
+                            <a:off x="0" y="0"/>
+                            <a:ext cx="152400" cy="152400"/>
+                          </a:xfrm>
+                          <a:prstGeom prst="rect">
+                            <a:avLst/>
+                          </a:prstGeom>
+                          <a:noFill/>
+                          <a:ln w="9525">
+                            <a:noFill/>
+                            <a:headEnd/>
+                            <a:tailEnd/>
+                          </a:ln>
+                        </pic:spPr>
+                      </pic:pic>
+                    </a:graphicData>
+                  </a:graphic>
+                </wp:inline>
+              </w:drawing>
+            </w:r>
+            <w:r>
+              <w:t xml:space="preserve"> </w:t>
+            </w:r>
+            <w:r>
+              <w:t xml:space="preserve"> </w:t>
+            </w:r>
+            <w:r>
+              <w:t xml:space="preserve">Ergänzung zur Vorlesung: Verfügbarkeit</w:t>
+            </w:r>
+          </w:p>
+        </w:tc>
+      </w:tr>
+      <w:tr>
+        <w:trPr>
+          <w:cantSplit/>
+        </w:trPr>
+        <w:tc>
+          <w:tcPr>
+            <w:tcMar>
+              <w:top w:w="108" w:type="dxa"/>
+              <w:bottom w:w="108" w:type="dxa"/>
+            </w:tcMar>
+          </w:tcPr>
+          <w:p>
+            <w:pPr>
+              <w:pStyle w:val="BodyText"/>
+            </w:pPr>
+            <w:pPr>
+              <w:spacing w:before="16"/>
+            </w:pPr>
+            <w:r>
+              <w:t xml:space="preserve">MTBF und MTTR lassen sich zur</w:t>
+            </w:r>
+            <w:r>
+              <w:t xml:space="preserve"> </w:t>
+            </w:r>
+            <w:r>
+              <w:rPr>
+                <w:b/>
+                <w:bCs/>
+              </w:rPr>
+              <w:t xml:space="preserve">Verfügbarkeit</w:t>
+            </w:r>
+            <w:r>
+              <w:t xml:space="preserve"> </w:t>
+            </w:r>
+            <w:r>
+              <w:t xml:space="preserve">verbinden: A = MTBF ÷ (MTBF + MTTR). Mit MTBF = 30 Tage und MTTR = 45 min ergibt sich A ≈ 99,9 %.</w:t>
+            </w:r>
+          </w:p>
+          <w:tbl>
+            <w:tblPr>
+              <w:tblStyle w:val="Table"/>
+              <w:tblW w:type="auto" w:w="0"/>
+              <w:tblLook w:firstRow="1" w:lastRow="0" w:firstColumn="0" w:lastColumn="0" w:noHBand="0" w:noVBand="0" w:val="0020"/>
+            </w:tblPr>
+            <w:tblGrid>
+              <w:gridCol w:w="3960"/>
+              <w:gridCol w:w="3960"/>
+            </w:tblGrid>
+            <w:tr>
+              <w:trPr>
+                <w:tblHeader w:val="on"/>
+              </w:trPr>
+              <w:tc>
+                <w:tcPr/>
+                <w:p>
+                  <w:pPr>
+                    <w:pStyle w:val="Compact"/>
+                  </w:pPr>
+                  <w:r>
+                    <w:t xml:space="preserve">Verfügbarkeit</w:t>
+                  </w:r>
+                </w:p>
+              </w:tc>
+              <w:tc>
+                <w:tcPr/>
+                <w:p>
+                  <w:pPr>
+                    <w:pStyle w:val="Compact"/>
+                  </w:pPr>
+                  <w:r>
+                    <w:t xml:space="preserve">Ausfall pro Jahr</w:t>
+                  </w:r>
+                </w:p>
+              </w:tc>
+            </w:tr>
+            <w:tr>
+              <w:tc>
+                <w:tcPr/>
+                <w:p>
+                  <w:pPr>
+                    <w:pStyle w:val="Compact"/>
+                  </w:pPr>
+                  <w:r>
+                    <w:t xml:space="preserve">99 %</w:t>
+                  </w:r>
+                </w:p>
+              </w:tc>
+              <w:tc>
+                <w:tcPr/>
+                <w:p>
+                  <w:pPr>
+                    <w:pStyle w:val="Compact"/>
+                  </w:pPr>
+                  <w:r>
+                    <w:t xml:space="preserve">ca. 3,7 Tage</w:t>
+                  </w:r>
+                </w:p>
+              </w:tc>
+            </w:tr>
+            <w:tr>
+              <w:tc>
+                <w:tcPr/>
+                <w:p>
+                  <w:pPr>
+                    <w:pStyle w:val="Compact"/>
+                  </w:pPr>
+                  <w:r>
+                    <w:t xml:space="preserve">99,9 %</w:t>
+                  </w:r>
+                </w:p>
+              </w:tc>
+              <w:tc>
+                <w:tcPr/>
+                <w:p>
+                  <w:pPr>
+                    <w:pStyle w:val="Compact"/>
+                  </w:pPr>
+                  <w:r>
+                    <w:t xml:space="preserve">ca. 8,8 Stunden</w:t>
+                  </w:r>
+                </w:p>
+              </w:tc>
+            </w:tr>
+            <w:tr>
+              <w:tc>
+                <w:tcPr/>
+                <w:p>
+                  <w:pPr>
+                    <w:pStyle w:val="Compact"/>
+                  </w:pPr>
+                  <w:r>
+                    <w:t xml:space="preserve">99,99 %</w:t>
+                  </w:r>
+                </w:p>
+              </w:tc>
+              <w:tc>
+                <w:tcPr/>
+                <w:p>
+                  <w:pPr>
+                    <w:pStyle w:val="Compact"/>
+                  </w:pPr>
+                  <w:r>
+                    <w:t xml:space="preserve">ca. 53 Minuten</w:t>
+                  </w:r>
+                </w:p>
+              </w:tc>
+            </w:tr>
+            <w:tr>
+              <w:tc>
+                <w:tcPr/>
+                <w:p>
+                  <w:pPr>
+                    <w:pStyle w:val="Compact"/>
+                  </w:pPr>
+                  <w:r>
+                    <w:t xml:space="preserve">99,999 %</w:t>
+                  </w:r>
+                </w:p>
+              </w:tc>
+              <w:tc>
+                <w:tcPr/>
+                <w:p>
+                  <w:pPr>
+                    <w:pStyle w:val="Compact"/>
+                  </w:pPr>
+                  <w:r>
+                    <w:t xml:space="preserve">ca. 5 Minuten</w:t>
+                  </w:r>
+                </w:p>
+              </w:tc>
+            </w:tr>
+          </w:tbl>
+          <w:p>
+            <w:pPr>
+              <w:pStyle w:val="BodyText"/>
+            </w:pPr>
+            <w:pPr>
+              <w:spacing w:after="16"/>
+            </w:pPr>
+            <w:r>
+              <w:t xml:space="preserve">Es gibt zwei Hebel: seltener ausfallen (MTBF erhöhen) oder schneller zurückkommen (MTTR senken). Resilienz setzt vor allem am zweiten Hebel an. Die Verfügbarkeit sagt allerdings nichts über Datenverlust (RPO) und Ausfalltiefe (Δ) aus: Dieselbe Verfügbarkeit kann aus einem langen oder aus vielen kurzen Ausfällen entstehen.</w:t>
+            </w:r>
+          </w:p>
+          <w:p/>
+        </w:tc>
+      </w:tr>
+    </w:tbl>
+    <w:bookmarkEnd w:id="27"/>
+    <w:bookmarkStart w:id="42" w:name="X0ad50e47d928f1e4970cd1288e7574496667fca"/>
     <w:p>
       <w:pPr>
         <w:pStyle w:val="Heading1"/>
@@ -1167,7 +1499,7 @@
         <w:t xml:space="preserve">, um Resilience Engineering verlässlich umzusetzen und zu bewerten.</w:t>
       </w:r>
     </w:p>
-    <w:bookmarkStart w:id="26" w:name="Xc7ea1e64c700d76b6873add610e3f2f5f8ffce0"/>
+    <w:bookmarkStart w:id="32" w:name="Xc7ea1e64c700d76b6873add610e3f2f5f8ffce0"/>
     <w:p>
       <w:pPr>
         <w:pStyle w:val="Heading2"/>
@@ -1372,18 +1704,18 @@
                 <wp:inline>
                   <wp:extent cx="152400" cy="152400"/>
                   <wp:effectExtent b="0" l="0" r="0" t="0"/>
-                  <wp:docPr descr="" title="" id="23" name="Picture"/>
+                  <wp:docPr descr="" title="" id="29" name="Picture"/>
                   <a:graphic>
                     <a:graphicData uri="http://schemas.openxmlformats.org/drawingml/2006/picture">
                       <pic:pic>
                         <pic:nvPicPr>
-                          <pic:cNvPr descr="C:\Users\dirkl\Tools\quarto\share\formats\docx\note.png" id="24" name="Picture"/>
+                          <pic:cNvPr descr="/usr/local/lib/python3.13/dist-packages/quarto_cli/share/formats/docx/note.png" id="30" name="Picture"/>
                           <pic:cNvPicPr>
                             <a:picLocks noChangeArrowheads="1" noChangeAspect="1"/>
                           </pic:cNvPicPr>
                         </pic:nvPicPr>
                         <pic:blipFill>
-                          <a:blip r:embed="rId22"/>
+                          <a:blip r:embed="rId28"/>
                           <a:stretch>
                             <a:fillRect/>
                           </a:stretch>
@@ -1464,7 +1796,7 @@
             <w:r>
               <w:t xml:space="preserve"> </w:t>
             </w:r>
-            <w:hyperlink r:id="rId25">
+            <w:hyperlink r:id="rId31">
               <w:r>
                 <w:rPr>
                   <w:rStyle w:val="Hyperlink"/>
@@ -1480,8 +1812,8 @@
         </w:tc>
       </w:tr>
     </w:tbl>
-    <w:bookmarkEnd w:id="26"/>
-    <w:bookmarkStart w:id="29" w:name="X43c05252681b27f61731e82a37288c6cd6e59dc"/>
+    <w:bookmarkEnd w:id="32"/>
+    <w:bookmarkStart w:id="35" w:name="X43c05252681b27f61731e82a37288c6cd6e59dc"/>
     <w:p>
       <w:pPr>
         <w:pStyle w:val="Heading2"/>
@@ -1604,18 +1936,18 @@
                 <wp:inline>
                   <wp:extent cx="152400" cy="152400"/>
                   <wp:effectExtent b="0" l="0" r="0" t="0"/>
-                  <wp:docPr descr="" title="" id="27" name="Picture"/>
+                  <wp:docPr descr="" title="" id="33" name="Picture"/>
                   <a:graphic>
                     <a:graphicData uri="http://schemas.openxmlformats.org/drawingml/2006/picture">
                       <pic:pic>
                         <pic:nvPicPr>
-                          <pic:cNvPr descr="C:\Users\dirkl\Tools\quarto\share\formats\docx\note.png" id="28" name="Picture"/>
+                          <pic:cNvPr descr="/usr/local/lib/python3.13/dist-packages/quarto_cli/share/formats/docx/note.png" id="34" name="Picture"/>
                           <pic:cNvPicPr>
                             <a:picLocks noChangeArrowheads="1" noChangeAspect="1"/>
                           </pic:cNvPicPr>
                         </pic:nvPicPr>
                         <pic:blipFill>
-                          <a:blip r:embed="rId22"/>
+                          <a:blip r:embed="rId28"/>
                           <a:stretch>
                             <a:fillRect/>
                           </a:stretch>
@@ -1686,7 +2018,7 @@
             <w:r>
               <w:t xml:space="preserve"> </w:t>
             </w:r>
-            <w:hyperlink r:id="rId25">
+            <w:hyperlink r:id="rId31">
               <w:r>
                 <w:rPr>
                   <w:rStyle w:val="Hyperlink"/>
@@ -1702,8 +2034,8 @@
         </w:tc>
       </w:tr>
     </w:tbl>
-    <w:bookmarkEnd w:id="29"/>
-    <w:bookmarkStart w:id="32" w:name="X92d99b012aa3161fb3a28dfe72c6cdb260a4139"/>
+    <w:bookmarkEnd w:id="35"/>
+    <w:bookmarkStart w:id="40" w:name="X92d99b012aa3161fb3a28dfe72c6cdb260a4139"/>
     <w:p>
       <w:pPr>
         <w:pStyle w:val="Heading2"/>
@@ -1976,18 +2308,18 @@
                 <wp:inline>
                   <wp:extent cx="152400" cy="152400"/>
                   <wp:effectExtent b="0" l="0" r="0" t="0"/>
-                  <wp:docPr descr="" title="" id="30" name="Picture"/>
+                  <wp:docPr descr="" title="" id="36" name="Picture"/>
                   <a:graphic>
                     <a:graphicData uri="http://schemas.openxmlformats.org/drawingml/2006/picture">
                       <pic:pic>
                         <pic:nvPicPr>
-                          <pic:cNvPr descr="C:\Users\dirkl\Tools\quarto\share\formats\docx\note.png" id="31" name="Picture"/>
+                          <pic:cNvPr descr="/usr/local/lib/python3.13/dist-packages/quarto_cli/share/formats/docx/note.png" id="37" name="Picture"/>
                           <pic:cNvPicPr>
                             <a:picLocks noChangeArrowheads="1" noChangeAspect="1"/>
                           </pic:cNvPicPr>
                         </pic:nvPicPr>
                         <pic:blipFill>
-                          <a:blip r:embed="rId22"/>
+                          <a:blip r:embed="rId28"/>
                           <a:stretch>
                             <a:fillRect/>
                           </a:stretch>
@@ -2058,7 +2390,7 @@
             <w:r>
               <w:t xml:space="preserve"> </w:t>
             </w:r>
-            <w:hyperlink r:id="rId25">
+            <w:hyperlink r:id="rId31">
               <w:r>
                 <w:rPr>
                   <w:rStyle w:val="Hyperlink"/>
@@ -2074,8 +2406,158 @@
         </w:tc>
       </w:tr>
     </w:tbl>
-    <w:bookmarkEnd w:id="32"/>
-    <w:bookmarkStart w:id="33" w:name="X267e25dd3ebda86249ee190f6c59adf4c34186c"/>
+    <w:p>
+      <w:pPr>
+        <w:pStyle w:val="BodyText"/>
+      </w:pPr>
+      <w:r>
+        <w:t xml:space="preserve"> </w:t>
+      </w:r>
+    </w:p>
+    <w:tbl>
+      <w:tblPr>
+        <w:tblStyle w:val="Table"/>
+        <w:tblLook w:firstRow="0" w:lastRow="0" w:firstColumn="0" w:lastColumn="0" w:noHBand="0" w:noVBand="0" w:val="0000"/>
+        <w:tblBorders>
+          <w:top w:val="single" w:sz="4" w:space="0" w:color="0758E5"/>
+          <w:left w:val="single" w:sz="24" w:space="0" w:color="0758E5"/>
+          <w:bottom w:val="single" w:sz="4" w:space="0" w:color="0758E5"/>
+          <w:right w:val="single" w:sz="4" w:space="0" w:color="0758E5"/>
+        </w:tblBorders>
+        <w:tblCellMar>
+          <w:left w:w="144" w:type="dxa"/>
+          <w:right w:w="144" w:type="dxa"/>
+        </w:tblCellMar>
+        <w:tblLook w:firstRow="0" w:lastRow="0" w:firstColumn="0" w:lastColumn="0" w:noHBand="0" w:noVBand="0" w:val="0000"/>
+      </w:tblPr>
+      <w:tr>
+        <w:trPr>
+          <w:cantSplit/>
+        </w:trPr>
+        <w:tc>
+          <w:tcPr>
+            <w:shd w:color="auto" w:fill="dae6fb" w:val="clear"/>
+            <w:tcMar>
+              <w:top w:w="92" w:type="dxa"/>
+              <w:bottom w:w="92" w:type="dxa"/>
+            </w:tcMar>
+          </w:tcPr>
+          <w:p>
+            <w:pPr>
+              <w:pStyle w:val="BodyText"/>
+            </w:pPr>
+            <w:pPr>
+              <w:spacing w:before="0" w:after="0"/>
+              <w:textAlignment w:val="center"/>
+            </w:pPr>
+            <w:r>
+              <w:drawing>
+                <wp:inline>
+                  <wp:extent cx="152400" cy="152400"/>
+                  <wp:effectExtent b="0" l="0" r="0" t="0"/>
+                  <wp:docPr descr="" title="" id="38" name="Picture"/>
+                  <a:graphic>
+                    <a:graphicData uri="http://schemas.openxmlformats.org/drawingml/2006/picture">
+                      <pic:pic>
+                        <pic:nvPicPr>
+                          <pic:cNvPr descr="/usr/local/lib/python3.13/dist-packages/quarto_cli/share/formats/docx/note.png" id="39" name="Picture"/>
+                          <pic:cNvPicPr>
+                            <a:picLocks noChangeArrowheads="1" noChangeAspect="1"/>
+                          </pic:cNvPicPr>
+                        </pic:nvPicPr>
+                        <pic:blipFill>
+                          <a:blip r:embed="rId28"/>
+                          <a:stretch>
+                            <a:fillRect/>
+                          </a:stretch>
+                        </pic:blipFill>
+                        <pic:spPr bwMode="auto">
+                          <a:xfrm>
+                            <a:off x="0" y="0"/>
+                            <a:ext cx="152400" cy="152400"/>
+                          </a:xfrm>
+                          <a:prstGeom prst="rect">
+                            <a:avLst/>
+                          </a:prstGeom>
+                          <a:noFill/>
+                          <a:ln w="9525">
+                            <a:noFill/>
+                            <a:headEnd/>
+                            <a:tailEnd/>
+                          </a:ln>
+                        </pic:spPr>
+                      </pic:pic>
+                    </a:graphicData>
+                  </a:graphic>
+                </wp:inline>
+              </w:drawing>
+            </w:r>
+            <w:r>
+              <w:t xml:space="preserve"> </w:t>
+            </w:r>
+            <w:r>
+              <w:t xml:space="preserve"> </w:t>
+            </w:r>
+            <w:r>
+              <w:t xml:space="preserve">Hinweis zur Aktualität: zwei Skalen in diesem Skript</w:t>
+            </w:r>
+          </w:p>
+        </w:tc>
+      </w:tr>
+      <w:tr>
+        <w:trPr>
+          <w:cantSplit/>
+        </w:trPr>
+        <w:tc>
+          <w:tcPr>
+            <w:tcMar>
+              <w:top w:w="108" w:type="dxa"/>
+              <w:bottom w:w="108" w:type="dxa"/>
+            </w:tcMar>
+          </w:tcPr>
+          <w:p>
+            <w:pPr>
+              <w:pStyle w:val="BodyText"/>
+            </w:pPr>
+            <w:pPr>
+              <w:spacing w:before="16" w:after="16"/>
+            </w:pPr>
+            <w:r>
+              <w:t xml:space="preserve">Dieses Skript nennt zwei fünfstufige Skalen: hier</w:t>
+            </w:r>
+            <w:r>
+              <w:t xml:space="preserve"> </w:t>
+            </w:r>
+            <w:r>
+              <w:rPr>
+                <w:i/>
+                <w:iCs/>
+              </w:rPr>
+              <w:t xml:space="preserve">Ad hoc – Initialisiert – Etabliert – Qualifiziert – Exzellent</w:t>
+            </w:r>
+            <w:r>
+              <w:t xml:space="preserve">, in Abschnitt 5.2</w:t>
+            </w:r>
+            <w:r>
+              <w:t xml:space="preserve"> </w:t>
+            </w:r>
+            <w:r>
+              <w:rPr>
+                <w:i/>
+                <w:iCs/>
+              </w:rPr>
+              <w:t xml:space="preserve">Ad hoc – Definiert – Etabliert – Gesteuert – Optimiert</w:t>
+            </w:r>
+            <w:r>
+              <w:t xml:space="preserve">. Beide beschreiben dieselbe Entwicklungslogik. Folien und Lernseite verwenden einheitlich die Bezeichnungen aus Abschnitt 5.2.</w:t>
+            </w:r>
+          </w:p>
+          <w:p/>
+        </w:tc>
+      </w:tr>
+    </w:tbl>
+    <w:bookmarkEnd w:id="40"/>
+    <w:bookmarkStart w:id="41" w:name="X267e25dd3ebda86249ee190f6c59adf4c34186c"/>
     <w:p>
       <w:pPr>
         <w:pStyle w:val="Heading2"/>
@@ -2198,9 +2680,9 @@
         <w:t xml:space="preserve">, in dem Metriken geplant, bewertet und verbessert werden. Messgrößen erzeugen Evidenz — Frameworks verankern sie strukturell.</w:t>
       </w:r>
     </w:p>
-    <w:bookmarkEnd w:id="33"/>
-    <w:bookmarkEnd w:id="34"/>
-    <w:bookmarkStart w:id="38" w:name="X45c14a42214a4479eba9026a54bf388d2fa4543"/>
+    <w:bookmarkEnd w:id="41"/>
+    <w:bookmarkEnd w:id="42"/>
+    <w:bookmarkStart w:id="49" w:name="X45c14a42214a4479eba9026a54bf388d2fa4543"/>
     <w:p>
       <w:pPr>
         <w:pStyle w:val="Heading1"/>
@@ -2245,7 +2727,7 @@
         <w:t xml:space="preserve">„Wie gut ist die Organisation vorbereitet, bevor der Störfall eintritt?“</w:t>
       </w:r>
     </w:p>
-    <w:bookmarkStart w:id="35" w:name="zweck-von-reifegradmodellen"/>
+    <w:bookmarkStart w:id="43" w:name="zweck-von-reifegradmodellen"/>
     <w:p>
       <w:pPr>
         <w:pStyle w:val="Heading2"/>
@@ -2262,8 +2744,8 @@
         <w:t xml:space="preserve">Reifegradmodelle dienen nicht der Bewertung vergangener Leistungen, sondern der Steuerung zukünftiger Fähigkeit. Sie sind damit ein Governance-Instrument und wirken präventiv — aber mit direktem Einfluss auf Resilienz.</w:t>
       </w:r>
     </w:p>
-    <w:bookmarkEnd w:id="35"/>
-    <w:bookmarkStart w:id="36" w:name="strukturtypik"/>
+    <w:bookmarkEnd w:id="43"/>
+    <w:bookmarkStart w:id="44" w:name="strukturtypik"/>
     <w:p>
       <w:pPr>
         <w:pStyle w:val="Heading2"/>
@@ -2393,8 +2875,8 @@
         <w:t xml:space="preserve">Diese Logik findet sich explizit z. B. in BSI-Standard 200-4 (vgl. BSI-200-4 Reifegradmodell) und implizit in ISO/IEC 27031 (Kapitel zu Testing &amp; Improvement).</w:t>
       </w:r>
     </w:p>
-    <w:bookmarkEnd w:id="36"/>
-    <w:bookmarkStart w:id="37" w:name="verbindung-zu-metriken"/>
+    <w:bookmarkEnd w:id="44"/>
+    <w:bookmarkStart w:id="48" w:name="verbindung-zu-metriken"/>
     <w:p>
       <w:pPr>
         <w:pStyle w:val="Heading2"/>
@@ -2503,9 +2985,64 @@
         <w:t xml:space="preserve">.</w:t>
       </w:r>
     </w:p>
-    <w:bookmarkEnd w:id="37"/>
-    <w:bookmarkEnd w:id="38"/>
-    <w:bookmarkStart w:id="39" w:name="X45a80d35110eb576e612426d0d080d663348a85"/>
+    <w:p>
+      <w:pPr>
+        <w:pStyle w:val="CaptionedFigure"/>
+      </w:pPr>
+      <w:r>
+        <w:drawing>
+          <wp:inline>
+            <wp:extent cx="4027170" cy="3376092"/>
+            <wp:effectExtent b="0" l="0" r="0" t="0"/>
+            <wp:docPr descr="Reifegrad und gemessene Recovery: Papiersicherheit, Zufallssicherheit und nachweisliche Resilienz" title="" id="46" name="Picture"/>
+            <a:graphic>
+              <a:graphicData uri="http://schemas.openxmlformats.org/drawingml/2006/picture">
+                <pic:pic>
+                  <pic:nvPicPr>
+                    <pic:cNvPr descr="../Präsentationen/Termin-02/assets/reifegrad-metrik-matrix.png" id="47" name="Picture"/>
+                    <pic:cNvPicPr>
+                      <a:picLocks noChangeArrowheads="1" noChangeAspect="1"/>
+                    </pic:cNvPicPr>
+                  </pic:nvPicPr>
+                  <pic:blipFill>
+                    <a:blip r:embed="rId45"/>
+                    <a:stretch>
+                      <a:fillRect/>
+                    </a:stretch>
+                  </pic:blipFill>
+                  <pic:spPr bwMode="auto">
+                    <a:xfrm>
+                      <a:off x="0" y="0"/>
+                      <a:ext cx="4027170" cy="3376092"/>
+                    </a:xfrm>
+                    <a:prstGeom prst="rect">
+                      <a:avLst/>
+                    </a:prstGeom>
+                    <a:noFill/>
+                    <a:ln w="9525">
+                      <a:noFill/>
+                      <a:headEnd/>
+                      <a:tailEnd/>
+                    </a:ln>
+                  </pic:spPr>
+                </pic:pic>
+              </a:graphicData>
+            </a:graphic>
+          </wp:inline>
+        </w:drawing>
+      </w:r>
+    </w:p>
+    <w:p>
+      <w:pPr>
+        <w:pStyle w:val="ImageCaption"/>
+      </w:pPr>
+      <w:r>
+        <w:t xml:space="preserve">Reifegrad und gemessene Recovery: Papiersicherheit, Zufallssicherheit und nachweisliche Resilienz</w:t>
+      </w:r>
+    </w:p>
+    <w:bookmarkEnd w:id="48"/>
+    <w:bookmarkEnd w:id="49"/>
+    <w:bookmarkStart w:id="56" w:name="X45a80d35110eb576e612426d0d080d663348a85"/>
     <w:p>
       <w:pPr>
         <w:pStyle w:val="Heading1"/>
@@ -2803,7 +3340,249 @@
     </w:p>
     <w:p>
       <w:pPr>
-        <w:pStyle w:val="FirstParagraph"/>
+        <w:pStyle w:val="CaptionedFigure"/>
+      </w:pPr>
+      <w:r>
+        <w:drawing>
+          <wp:inline>
+            <wp:extent cx="4602480" cy="3088695"/>
+            <wp:effectExtent b="0" l="0" r="0" t="0"/>
+            <wp:docPr descr="Dieselbe Störung, drei Architekturen: Hard-Fail, Failover und Graceful Degradation" title="" id="51" name="Picture"/>
+            <a:graphic>
+              <a:graphicData uri="http://schemas.openxmlformats.org/drawingml/2006/picture">
+                <pic:pic>
+                  <pic:nvPicPr>
+                    <pic:cNvPr descr="../Präsentationen/Termin-02/assets/gleiche-stoerung-drei-kurven.png" id="52" name="Picture"/>
+                    <pic:cNvPicPr>
+                      <a:picLocks noChangeArrowheads="1" noChangeAspect="1"/>
+                    </pic:cNvPicPr>
+                  </pic:nvPicPr>
+                  <pic:blipFill>
+                    <a:blip r:embed="rId50"/>
+                    <a:stretch>
+                      <a:fillRect/>
+                    </a:stretch>
+                  </pic:blipFill>
+                  <pic:spPr bwMode="auto">
+                    <a:xfrm>
+                      <a:off x="0" y="0"/>
+                      <a:ext cx="4602480" cy="3088695"/>
+                    </a:xfrm>
+                    <a:prstGeom prst="rect">
+                      <a:avLst/>
+                    </a:prstGeom>
+                    <a:noFill/>
+                    <a:ln w="9525">
+                      <a:noFill/>
+                      <a:headEnd/>
+                      <a:tailEnd/>
+                    </a:ln>
+                  </pic:spPr>
+                </pic:pic>
+              </a:graphicData>
+            </a:graphic>
+          </wp:inline>
+        </w:drawing>
+      </w:r>
+    </w:p>
+    <w:p>
+      <w:pPr>
+        <w:pStyle w:val="ImageCaption"/>
+      </w:pPr>
+      <w:r>
+        <w:t xml:space="preserve">Dieselbe Störung, drei Architekturen: Hard-Fail, Failover und Graceful Degradation</w:t>
+      </w:r>
+    </w:p>
+    <w:tbl>
+      <w:tblPr>
+        <w:tblStyle w:val="Table"/>
+        <w:tblLook w:firstRow="0" w:lastRow="0" w:firstColumn="0" w:lastColumn="0" w:noHBand="0" w:noVBand="0" w:val="0000"/>
+        <w:tblBorders>
+          <w:top w:val="single" w:sz="4" w:space="0" w:color="00A047"/>
+          <w:left w:val="single" w:sz="24" w:space="0" w:color="00A047"/>
+          <w:bottom w:val="single" w:sz="4" w:space="0" w:color="00A047"/>
+          <w:right w:val="single" w:sz="4" w:space="0" w:color="00A047"/>
+        </w:tblBorders>
+        <w:tblCellMar>
+          <w:left w:w="144" w:type="dxa"/>
+          <w:right w:w="144" w:type="dxa"/>
+        </w:tblCellMar>
+        <w:tblLook w:firstRow="0" w:lastRow="0" w:firstColumn="0" w:lastColumn="0" w:noHBand="0" w:noVBand="0" w:val="0000"/>
+      </w:tblPr>
+      <w:tr>
+        <w:trPr>
+          <w:cantSplit/>
+        </w:trPr>
+        <w:tc>
+          <w:tcPr>
+            <w:shd w:color="auto" w:fill="ccf1e3" w:val="clear"/>
+            <w:tcMar>
+              <w:top w:w="92" w:type="dxa"/>
+              <w:bottom w:w="92" w:type="dxa"/>
+            </w:tcMar>
+          </w:tcPr>
+          <w:p>
+            <w:pPr>
+              <w:pStyle w:val="BodyText"/>
+            </w:pPr>
+            <w:pPr>
+              <w:spacing w:before="0" w:after="0"/>
+              <w:textAlignment w:val="center"/>
+            </w:pPr>
+            <w:r>
+              <w:drawing>
+                <wp:inline>
+                  <wp:extent cx="152400" cy="152400"/>
+                  <wp:effectExtent b="0" l="0" r="0" t="0"/>
+                  <wp:docPr descr="" title="" id="53" name="Picture"/>
+                  <a:graphic>
+                    <a:graphicData uri="http://schemas.openxmlformats.org/drawingml/2006/picture">
+                      <pic:pic>
+                        <pic:nvPicPr>
+                          <pic:cNvPr descr="/usr/local/lib/python3.13/dist-packages/quarto_cli/share/formats/docx/tip.png" id="54" name="Picture"/>
+                          <pic:cNvPicPr>
+                            <a:picLocks noChangeArrowheads="1" noChangeAspect="1"/>
+                          </pic:cNvPicPr>
+                        </pic:nvPicPr>
+                        <pic:blipFill>
+                          <a:blip r:embed="rId24"/>
+                          <a:stretch>
+                            <a:fillRect/>
+                          </a:stretch>
+                        </pic:blipFill>
+                        <pic:spPr bwMode="auto">
+                          <a:xfrm>
+                            <a:off x="0" y="0"/>
+                            <a:ext cx="152400" cy="152400"/>
+                          </a:xfrm>
+                          <a:prstGeom prst="rect">
+                            <a:avLst/>
+                          </a:prstGeom>
+                          <a:noFill/>
+                          <a:ln w="9525">
+                            <a:noFill/>
+                            <a:headEnd/>
+                            <a:tailEnd/>
+                          </a:ln>
+                        </pic:spPr>
+                      </pic:pic>
+                    </a:graphicData>
+                  </a:graphic>
+                </wp:inline>
+              </w:drawing>
+            </w:r>
+            <w:r>
+              <w:t xml:space="preserve"> </w:t>
+            </w:r>
+            <w:r>
+              <w:t xml:space="preserve"> </w:t>
+            </w:r>
+            <w:r>
+              <w:t xml:space="preserve">Ergänzung zur Vorlesung: dokumentierte Vorfälle</w:t>
+            </w:r>
+          </w:p>
+        </w:tc>
+      </w:tr>
+      <w:tr>
+        <w:trPr>
+          <w:cantSplit/>
+        </w:trPr>
+        <w:tc>
+          <w:tcPr>
+            <w:tcMar>
+              <w:top w:w="108" w:type="dxa"/>
+              <w:bottom w:w="108" w:type="dxa"/>
+            </w:tcMar>
+          </w:tcPr>
+          <w:p>
+            <w:pPr>
+              <w:pStyle w:val="BodyText"/>
+            </w:pPr>
+            <w:pPr>
+              <w:spacing w:before="16"/>
+            </w:pPr>
+            <w:r>
+              <w:rPr>
+                <w:b/>
+                <w:bCs/>
+              </w:rPr>
+              <w:t xml:space="preserve">AWS us-east-1 (7. Dezember 2021):</w:t>
+            </w:r>
+            <w:r>
+              <w:t xml:space="preserve"> </w:t>
+            </w:r>
+            <w:r>
+              <w:t xml:space="preserve">Eine automatisierte Skalierung überlastete das interne AWS-Netz. Es war rund 7 Stunden gestört, einzelne Dienste bis zu 11 Stunden. Laufende Instanzen arbeiteten weiter, neue starteten nicht; auch Monitoring und Statusseite waren beeinträchtigt. Das konkretisiert Fall 2: Wer erst im Ernstfall Kapazität hochfahren wollte, stand still, und gerade im Störfall fehlten Messwerte.</w:t>
+            </w:r>
+          </w:p>
+          <w:p>
+            <w:pPr>
+              <w:pStyle w:val="BodyText"/>
+            </w:pPr>
+            <w:r>
+              <w:rPr>
+                <w:b/>
+                <w:bCs/>
+              </w:rPr>
+              <w:t xml:space="preserve">OVHcloud, Straßburg (10. März 2021):</w:t>
+            </w:r>
+            <w:r>
+              <w:t xml:space="preserve"> </w:t>
+            </w:r>
+            <w:r>
+              <w:t xml:space="preserve">Das Rechenzentrum SBG2 brannte aus, SBG1 wurde beschädigt. Kunden, deren Backup im selben Gebäude lag wie die Produktion, verloren beides – das RPO war faktisch unbegrenzt. 2023 sprach ein französisches Handelsgericht zwei Kunden Schadensersatz zu, weil die Sicherungen nicht wie vereinbart getrennt lagen.</w:t>
+            </w:r>
+          </w:p>
+          <w:p>
+            <w:pPr>
+              <w:pStyle w:val="BodyText"/>
+            </w:pPr>
+            <w:r>
+              <w:rPr>
+                <w:b/>
+                <w:bCs/>
+              </w:rPr>
+              <w:t xml:space="preserve">GitLab.com (31. Januar 2017):</w:t>
+            </w:r>
+            <w:r>
+              <w:t xml:space="preserve"> </w:t>
+            </w:r>
+            <w:r>
+              <w:t xml:space="preserve">Ein Administrator löschte versehentlich rund 300 GB auf der Produktionsdatenbank. Drei von vier Sicherungswegen hatten unbemerkt versagt; gerettet hat ein zufällig sechs Stunden alter Snapshot. Ergebnis: etwa 6 Stunden Datenverlust und rund 18 Stunden Ausfall. Laut Postmortem war niemand für die Backups verantwortlich und niemand testete sie – das tatsächliche RPO zeigt erst der Restore.</w:t>
+            </w:r>
+          </w:p>
+          <w:p>
+            <w:pPr>
+              <w:pStyle w:val="BodyText"/>
+            </w:pPr>
+            <w:pPr>
+              <w:spacing w:after="16"/>
+            </w:pPr>
+            <w:r>
+              <w:t xml:space="preserve">Quellenangaben unter</w:t>
+            </w:r>
+            <w:r>
+              <w:t xml:space="preserve"> </w:t>
+            </w:r>
+            <w:hyperlink r:id="rId55">
+              <w:r>
+                <w:rPr>
+                  <w:rStyle w:val="Hyperlink"/>
+                </w:rPr>
+                <w:t xml:space="preserve">Quellen</w:t>
+              </w:r>
+            </w:hyperlink>
+            <w:r>
+              <w:t xml:space="preserve">.</w:t>
+            </w:r>
+          </w:p>
+          <w:p/>
+        </w:tc>
+      </w:tr>
+    </w:tbl>
+    <w:p>
+      <w:pPr>
+        <w:pStyle w:val="BodyText"/>
       </w:pPr>
       <w:r>
         <w:rPr>
@@ -2848,8 +3627,8 @@
         <w:t xml:space="preserve">. Zwei Organisationen mit identischem Ereignis können vollständig unterschiedlich resilient wirken, je nach Architektur, Reifegrad und Recovery-Praxis.</w:t>
       </w:r>
     </w:p>
-    <w:bookmarkEnd w:id="39"/>
-    <w:bookmarkStart w:id="40" w:name="X07fad3be853cd867c9acabb13c701f6c1bb61a7"/>
+    <w:bookmarkEnd w:id="56"/>
+    <w:bookmarkStart w:id="57" w:name="X07fad3be853cd867c9acabb13c701f6c1bb61a7"/>
     <w:p>
       <w:pPr>
         <w:pStyle w:val="Heading1"/>
@@ -3274,8 +4053,8 @@
         <w:t xml:space="preserve">zu verinnerlichen.</w:t>
       </w:r>
     </w:p>
-    <w:bookmarkEnd w:id="40"/>
-    <w:bookmarkStart w:id="41" w:name="Xaa6fa20ac7325fe462d380227a4f79c771d38c5"/>
+    <w:bookmarkEnd w:id="57"/>
+    <w:bookmarkStart w:id="58" w:name="Xaa6fa20ac7325fe462d380227a4f79c771d38c5"/>
     <w:p>
       <w:pPr>
         <w:pStyle w:val="Heading1"/>
@@ -3475,8 +4254,8 @@
         <w:t xml:space="preserve">, nicht von Technologie alleine.</w:t>
       </w:r>
     </w:p>
-    <w:bookmarkEnd w:id="41"/>
-    <w:bookmarkStart w:id="42" w:name="prüfungsrelevante-leitfragen"/>
+    <w:bookmarkEnd w:id="58"/>
+    <w:bookmarkStart w:id="59" w:name="prüfungsrelevante-leitfragen"/>
     <w:p>
       <w:pPr>
         <w:pStyle w:val="Heading1"/>
@@ -3629,8 +4408,8 @@
         <w:t xml:space="preserve">.</w:t>
       </w:r>
     </w:p>
-    <w:bookmarkEnd w:id="42"/>
-    <w:bookmarkStart w:id="49" w:name="bibliography"/>
+    <w:bookmarkEnd w:id="59"/>
+    <w:bookmarkStart w:id="66" w:name="bibliography"/>
     <w:p>
       <w:pPr>
         <w:pStyle w:val="Heading1"/>
@@ -3639,8 +4418,8 @@
         <w:t xml:space="preserve">Literatur</w:t>
       </w:r>
     </w:p>
-    <w:bookmarkStart w:id="48" w:name="refs"/>
-    <w:bookmarkStart w:id="43" w:name="ref-bsi2004"/>
+    <w:bookmarkStart w:id="65" w:name="refs"/>
+    <w:bookmarkStart w:id="60" w:name="ref-bsi2004"/>
     <w:p>
       <w:pPr>
         <w:pStyle w:val="Bibliography"/>
@@ -3649,8 +4428,8 @@
         <w:t xml:space="preserve">BSI-Standard 200-4: Business Continuity Management (2023).</w:t>
       </w:r>
     </w:p>
-    <w:bookmarkEnd w:id="43"/>
-    <w:bookmarkStart w:id="45" w:name="ref-iso27031"/>
+    <w:bookmarkEnd w:id="60"/>
+    <w:bookmarkStart w:id="62" w:name="ref-iso27031"/>
     <w:p>
       <w:pPr>
         <w:pStyle w:val="Bibliography"/>
@@ -3661,7 +4440,7 @@
       <w:r>
         <w:t xml:space="preserve"> </w:t>
       </w:r>
-      <w:hyperlink r:id="rId44">
+      <w:hyperlink r:id="rId61">
         <w:r>
           <w:rPr>
             <w:rStyle w:val="Hyperlink"/>
@@ -3673,8 +4452,8 @@
         <w:t xml:space="preserve">.</w:t>
       </w:r>
     </w:p>
-    <w:bookmarkEnd w:id="45"/>
-    <w:bookmarkStart w:id="47" w:name="ref-nist800160v2r1"/>
+    <w:bookmarkEnd w:id="62"/>
+    <w:bookmarkStart w:id="64" w:name="ref-nist800160v2r1"/>
     <w:p>
       <w:pPr>
         <w:pStyle w:val="Bibliography"/>
@@ -3698,7 +4477,7 @@
       <w:r>
         <w:t xml:space="preserve"> </w:t>
       </w:r>
-      <w:hyperlink r:id="rId46">
+      <w:hyperlink r:id="rId63">
         <w:r>
           <w:rPr>
             <w:rStyle w:val="Hyperlink"/>
@@ -3710,9 +4489,9 @@
         <w:t xml:space="preserve">.</w:t>
       </w:r>
     </w:p>
-    <w:bookmarkEnd w:id="47"/>
-    <w:bookmarkEnd w:id="48"/>
-    <w:bookmarkEnd w:id="49"/>
+    <w:bookmarkEnd w:id="64"/>
+    <w:bookmarkEnd w:id="65"/>
+    <w:bookmarkEnd w:id="66"/>
     <w:sectPr>
       <w:headerReference r:id="rId9" w:type="default"/>
       <w:footerReference r:id="rId10" w:type="default"/>

</xml_diff>